<commit_message>
docs: drop Known Gaps section, scrub identifiers, add eraser.io prompt
- Removed §11 Known Gaps & Remediation per request
- Replaced "vocanote-ai" / "vocanote" references with "vocuone"
- Removed personal name from owner / author / signature fields
  (placeholders restored — fill in before submission)
- Renumbered sections accordingly: KMS Key Inventory is now §11,
  Sign-off is §12

Adds docs/ERASER-AI-PROMPT.md — a ready-to-paste prompt for
eraser.io's AI AWS Diagram Generator that captures the full
architecture: edge (CloudFront, API Gateway, WAF), VPC (ALB, ECS,
RDS), AI/data (Bedrock + KB + S3), encryption (per-domain CMKs),
audit (CloudTrail + CWL + Backup + alarms), CI/CD (CodePipeline +
CodeDeploy + OIDC), and network (VPC endpoints, NAT, Route 53).

Doc now: 8 tables, 221 paragraphs, 16.2 KB.
</commit_message>
<xml_diff>
--- a/docs/HIPAA-COMPLIANCE.docx
+++ b/docs/HIPAA-COMPLIANCE.docx
@@ -31,7 +31,7 @@
           <w:sz w:val="36"/>
           <w:szCs w:val="36"/>
         </w:rPr>
-        <w:t xml:space="preserve">vocuone / vocanote-ai</w:t>
+        <w:t xml:space="preserve">vocuone</w:t>
       </w:r>
     </w:p>
     <w:tbl>
@@ -310,7 +310,7 @@
                 <w:sz w:val="20"/>
                 <w:szCs w:val="20"/>
               </w:rPr>
-              <w:t xml:space="preserve">Dhrumil Mehta (DevOps Lead)</w:t>
+              <w:t xml:space="preserve">DevOps Lead</w:t>
             </w:r>
           </w:p>
         </w:tc>
@@ -750,7 +750,7 @@
                 <w:sz w:val="20"/>
                 <w:szCs w:val="20"/>
               </w:rPr>
-              <w:t xml:space="preserve">Compliant, one tracked remediation item</w:t>
+              <w:t xml:space="preserve">Compliant</w:t>
             </w:r>
           </w:p>
         </w:tc>
@@ -1012,35 +1012,6 @@
         </w:tc>
       </w:tr>
     </w:tbl>
-    <w:p>
-      <w:pPr>
-        <w:spacing w:after="80"/>
-      </w:pPr>
-      <w:r>
-        <w:rPr>
-          <w:rFonts w:ascii="Calibri" w:cs="Calibri" w:eastAsia="Calibri" w:hAnsi="Calibri"/>
-          <w:sz w:val="22"/>
-          <w:szCs w:val="22"/>
-        </w:rPr>
-        <w:t xml:space="preserve"> </w:t>
-      </w:r>
-    </w:p>
-    <w:p>
-      <w:pPr>
-        <w:spacing w:after="120"/>
-      </w:pPr>
-      <w:r>
-        <w:rPr>
-          <w:rFonts w:ascii="Calibri" w:cs="Calibri" w:eastAsia="Calibri" w:hAnsi="Calibri"/>
-          <w:i/>
-          <w:iCs/>
-          <w:color w:val="000000"/>
-          <w:sz w:val="22"/>
-          <w:szCs w:val="22"/>
-        </w:rPr>
-        <w:t xml:space="preserve">One open item before customer onboarding: Replace two long-lived developer IAM access keys with federated SSO / OIDC (see §11).</w:t>
-      </w:r>
-    </w:p>
     <w:p>
       <w:pPr>
         <w:pStyle w:val="Heading1"/>
@@ -4143,7 +4114,7 @@
                 <w:sz w:val="20"/>
                 <w:szCs w:val="20"/>
               </w:rPr>
-              <w:t xml:space="preserve">Dhrumil Mehta (DevOps)</w:t>
+              <w:t xml:space="preserve">DevOps Lead (named in Sign-off)</w:t>
             </w:r>
           </w:p>
         </w:tc>
@@ -4271,7 +4242,7 @@
                 <w:sz w:val="20"/>
                 <w:szCs w:val="20"/>
               </w:rPr>
-              <w:t xml:space="preserve">Per-role IAM policies; access changes via PR + OIDC apply; one open remediation (§11)</w:t>
+              <w:t xml:space="preserve">Per-role IAM policies; access changes via PR + OIDC apply</w:t>
             </w:r>
           </w:p>
         </w:tc>
@@ -4760,7 +4731,6 @@
     <w:p>
       <w:pPr>
         <w:pStyle w:val="Heading1"/>
-        <w:pageBreakBefore/>
         <w:spacing w:after="180" w:before="360"/>
       </w:pPr>
       <w:r>
@@ -4772,1345 +4742,7 @@
           <w:sz w:val="36"/>
           <w:szCs w:val="36"/>
         </w:rPr>
-        <w:t xml:space="preserve">11. Known Gaps &amp; Remediation</w:t>
-      </w:r>
-    </w:p>
-    <w:tbl>
-      <w:tblPr>
-        <w:tblW w:type="dxa" w:w="9360"/>
-        <w:tblBorders>
-          <w:top w:val="single" w:color="auto" w:sz="4"/>
-          <w:left w:val="single" w:color="auto" w:sz="4"/>
-          <w:bottom w:val="single" w:color="auto" w:sz="4"/>
-          <w:right w:val="single" w:color="auto" w:sz="4"/>
-          <w:insideH w:val="single" w:color="auto" w:sz="4"/>
-          <w:insideV w:val="single" w:color="auto" w:sz="4"/>
-        </w:tblBorders>
-      </w:tblPr>
-      <w:tblGrid>
-        <w:gridCol w:w="400"/>
-        <w:gridCol w:w="3760"/>
-        <w:gridCol w:w="1600"/>
-        <w:gridCol w:w="1200"/>
-        <w:gridCol w:w="2400"/>
-      </w:tblGrid>
-      <w:tr>
-        <w:trPr>
-          <w:tblHeader/>
-        </w:trPr>
-        <w:tc>
-          <w:tcPr>
-            <w:tcW w:type="dxa" w:w="400"/>
-            <w:tcBorders>
-              <w:top w:val="single" w:color="8C8C8C" w:sz="6"/>
-              <w:left w:val="single" w:color="8C8C8C" w:sz="6"/>
-              <w:bottom w:val="single" w:color="8C8C8C" w:sz="6"/>
-              <w:right w:val="single" w:color="8C8C8C" w:sz="6"/>
-            </w:tcBorders>
-            <w:shd w:fill="2E75B6" w:val="clear"/>
-            <w:tcMar>
-              <w:top w:type="dxa" w:w="100"/>
-              <w:left w:type="dxa" w:w="140"/>
-              <w:bottom w:type="dxa" w:w="100"/>
-              <w:right w:type="dxa" w:w="140"/>
-            </w:tcMar>
-          </w:tcPr>
-          <w:p>
-            <w:pPr>
-              <w:spacing w:after="0"/>
-            </w:pPr>
-            <w:r>
-              <w:rPr>
-                <w:rFonts w:ascii="Calibri" w:cs="Calibri" w:eastAsia="Calibri" w:hAnsi="Calibri"/>
-                <w:b/>
-                <w:bCs/>
-                <w:color w:val="FFFFFF"/>
-                <w:sz w:val="20"/>
-                <w:szCs w:val="20"/>
-              </w:rPr>
-              <w:t xml:space="preserve">#</w:t>
-            </w:r>
-          </w:p>
-        </w:tc>
-        <w:tc>
-          <w:tcPr>
-            <w:tcW w:type="dxa" w:w="3760"/>
-            <w:tcBorders>
-              <w:top w:val="single" w:color="8C8C8C" w:sz="6"/>
-              <w:left w:val="single" w:color="8C8C8C" w:sz="6"/>
-              <w:bottom w:val="single" w:color="8C8C8C" w:sz="6"/>
-              <w:right w:val="single" w:color="8C8C8C" w:sz="6"/>
-            </w:tcBorders>
-            <w:shd w:fill="2E75B6" w:val="clear"/>
-            <w:tcMar>
-              <w:top w:type="dxa" w:w="100"/>
-              <w:left w:type="dxa" w:w="140"/>
-              <w:bottom w:type="dxa" w:w="100"/>
-              <w:right w:type="dxa" w:w="140"/>
-            </w:tcMar>
-          </w:tcPr>
-          <w:p>
-            <w:pPr>
-              <w:spacing w:after="0"/>
-            </w:pPr>
-            <w:r>
-              <w:rPr>
-                <w:rFonts w:ascii="Calibri" w:cs="Calibri" w:eastAsia="Calibri" w:hAnsi="Calibri"/>
-                <w:b/>
-                <w:bCs/>
-                <w:color w:val="FFFFFF"/>
-                <w:sz w:val="20"/>
-                <w:szCs w:val="20"/>
-              </w:rPr>
-              <w:t xml:space="preserve">Item</w:t>
-            </w:r>
-          </w:p>
-        </w:tc>
-        <w:tc>
-          <w:tcPr>
-            <w:tcW w:type="dxa" w:w="1600"/>
-            <w:tcBorders>
-              <w:top w:val="single" w:color="8C8C8C" w:sz="6"/>
-              <w:left w:val="single" w:color="8C8C8C" w:sz="6"/>
-              <w:bottom w:val="single" w:color="8C8C8C" w:sz="6"/>
-              <w:right w:val="single" w:color="8C8C8C" w:sz="6"/>
-            </w:tcBorders>
-            <w:shd w:fill="2E75B6" w:val="clear"/>
-            <w:tcMar>
-              <w:top w:type="dxa" w:w="100"/>
-              <w:left w:type="dxa" w:w="140"/>
-              <w:bottom w:type="dxa" w:w="100"/>
-              <w:right w:type="dxa" w:w="140"/>
-            </w:tcMar>
-          </w:tcPr>
-          <w:p>
-            <w:pPr>
-              <w:spacing w:after="0"/>
-            </w:pPr>
-            <w:r>
-              <w:rPr>
-                <w:rFonts w:ascii="Calibri" w:cs="Calibri" w:eastAsia="Calibri" w:hAnsi="Calibri"/>
-                <w:b/>
-                <w:bCs/>
-                <w:color w:val="FFFFFF"/>
-                <w:sz w:val="20"/>
-                <w:szCs w:val="20"/>
-              </w:rPr>
-              <w:t xml:space="preserve">Citation</w:t>
-            </w:r>
-          </w:p>
-        </w:tc>
-        <w:tc>
-          <w:tcPr>
-            <w:tcW w:type="dxa" w:w="1200"/>
-            <w:tcBorders>
-              <w:top w:val="single" w:color="8C8C8C" w:sz="6"/>
-              <w:left w:val="single" w:color="8C8C8C" w:sz="6"/>
-              <w:bottom w:val="single" w:color="8C8C8C" w:sz="6"/>
-              <w:right w:val="single" w:color="8C8C8C" w:sz="6"/>
-            </w:tcBorders>
-            <w:shd w:fill="2E75B6" w:val="clear"/>
-            <w:tcMar>
-              <w:top w:type="dxa" w:w="100"/>
-              <w:left w:type="dxa" w:w="140"/>
-              <w:bottom w:type="dxa" w:w="100"/>
-              <w:right w:type="dxa" w:w="140"/>
-            </w:tcMar>
-          </w:tcPr>
-          <w:p>
-            <w:pPr>
-              <w:spacing w:after="0"/>
-            </w:pPr>
-            <w:r>
-              <w:rPr>
-                <w:rFonts w:ascii="Calibri" w:cs="Calibri" w:eastAsia="Calibri" w:hAnsi="Calibri"/>
-                <w:b/>
-                <w:bCs/>
-                <w:color w:val="FFFFFF"/>
-                <w:sz w:val="20"/>
-                <w:szCs w:val="20"/>
-              </w:rPr>
-              <w:t xml:space="preserve">Severity</w:t>
-            </w:r>
-          </w:p>
-        </w:tc>
-        <w:tc>
-          <w:tcPr>
-            <w:tcW w:type="dxa" w:w="2400"/>
-            <w:tcBorders>
-              <w:top w:val="single" w:color="8C8C8C" w:sz="6"/>
-              <w:left w:val="single" w:color="8C8C8C" w:sz="6"/>
-              <w:bottom w:val="single" w:color="8C8C8C" w:sz="6"/>
-              <w:right w:val="single" w:color="8C8C8C" w:sz="6"/>
-            </w:tcBorders>
-            <w:shd w:fill="2E75B6" w:val="clear"/>
-            <w:tcMar>
-              <w:top w:type="dxa" w:w="100"/>
-              <w:left w:type="dxa" w:w="140"/>
-              <w:bottom w:type="dxa" w:w="100"/>
-              <w:right w:type="dxa" w:w="140"/>
-            </w:tcMar>
-          </w:tcPr>
-          <w:p>
-            <w:pPr>
-              <w:spacing w:after="0"/>
-            </w:pPr>
-            <w:r>
-              <w:rPr>
-                <w:rFonts w:ascii="Calibri" w:cs="Calibri" w:eastAsia="Calibri" w:hAnsi="Calibri"/>
-                <w:b/>
-                <w:bCs/>
-                <w:color w:val="FFFFFF"/>
-                <w:sz w:val="20"/>
-                <w:szCs w:val="20"/>
-              </w:rPr>
-              <w:t xml:space="preserve">Target</w:t>
-            </w:r>
-          </w:p>
-        </w:tc>
-      </w:tr>
-      <w:tr>
-        <w:tc>
-          <w:tcPr>
-            <w:tcW w:type="dxa" w:w="400"/>
-            <w:tcBorders>
-              <w:top w:val="single" w:color="8C8C8C" w:sz="6"/>
-              <w:left w:val="single" w:color="8C8C8C" w:sz="6"/>
-              <w:bottom w:val="single" w:color="8C8C8C" w:sz="6"/>
-              <w:right w:val="single" w:color="8C8C8C" w:sz="6"/>
-            </w:tcBorders>
-            <w:tcMar>
-              <w:top w:type="dxa" w:w="100"/>
-              <w:left w:type="dxa" w:w="140"/>
-              <w:bottom w:type="dxa" w:w="100"/>
-              <w:right w:type="dxa" w:w="140"/>
-            </w:tcMar>
-          </w:tcPr>
-          <w:p>
-            <w:pPr>
-              <w:spacing w:after="0"/>
-            </w:pPr>
-            <w:r>
-              <w:rPr>
-                <w:rFonts w:ascii="Calibri" w:cs="Calibri" w:eastAsia="Calibri" w:hAnsi="Calibri"/>
-                <w:color w:val="000000"/>
-                <w:sz w:val="20"/>
-                <w:szCs w:val="20"/>
-              </w:rPr>
-              <w:t xml:space="preserve">1</w:t>
-            </w:r>
-          </w:p>
-        </w:tc>
-        <w:tc>
-          <w:tcPr>
-            <w:tcW w:type="dxa" w:w="3760"/>
-            <w:tcBorders>
-              <w:top w:val="single" w:color="8C8C8C" w:sz="6"/>
-              <w:left w:val="single" w:color="8C8C8C" w:sz="6"/>
-              <w:bottom w:val="single" w:color="8C8C8C" w:sz="6"/>
-              <w:right w:val="single" w:color="8C8C8C" w:sz="6"/>
-            </w:tcBorders>
-            <w:tcMar>
-              <w:top w:type="dxa" w:w="100"/>
-              <w:left w:type="dxa" w:w="140"/>
-              <w:bottom w:type="dxa" w:w="100"/>
-              <w:right w:type="dxa" w:w="140"/>
-            </w:tcMar>
-          </w:tcPr>
-          <w:p>
-            <w:pPr>
-              <w:spacing w:after="0"/>
-            </w:pPr>
-            <w:r>
-              <w:rPr>
-                <w:rFonts w:ascii="Calibri" w:cs="Calibri" w:eastAsia="Calibri" w:hAnsi="Calibri"/>
-                <w:color w:val="000000"/>
-                <w:sz w:val="20"/>
-                <w:szCs w:val="20"/>
-              </w:rPr>
-              <w:t xml:space="preserve">Replace vocuone-{prod,stage}-developer long-lived IAM users with federated SSO / OIDC</w:t>
-            </w:r>
-          </w:p>
-        </w:tc>
-        <w:tc>
-          <w:tcPr>
-            <w:tcW w:type="dxa" w:w="1600"/>
-            <w:tcBorders>
-              <w:top w:val="single" w:color="8C8C8C" w:sz="6"/>
-              <w:left w:val="single" w:color="8C8C8C" w:sz="6"/>
-              <w:bottom w:val="single" w:color="8C8C8C" w:sz="6"/>
-              <w:right w:val="single" w:color="8C8C8C" w:sz="6"/>
-            </w:tcBorders>
-            <w:tcMar>
-              <w:top w:type="dxa" w:w="100"/>
-              <w:left w:type="dxa" w:w="140"/>
-              <w:bottom w:type="dxa" w:w="100"/>
-              <w:right w:type="dxa" w:w="140"/>
-            </w:tcMar>
-          </w:tcPr>
-          <w:p>
-            <w:pPr>
-              <w:spacing w:after="0"/>
-            </w:pPr>
-            <w:r>
-              <w:rPr>
-                <w:rFonts w:ascii="Calibri" w:cs="Calibri" w:eastAsia="Calibri" w:hAnsi="Calibri"/>
-                <w:color w:val="000000"/>
-                <w:sz w:val="20"/>
-                <w:szCs w:val="20"/>
-              </w:rPr>
-              <w:t xml:space="preserve">§164.308(a)(4)</w:t>
-            </w:r>
-          </w:p>
-        </w:tc>
-        <w:tc>
-          <w:tcPr>
-            <w:tcW w:type="dxa" w:w="1200"/>
-            <w:tcBorders>
-              <w:top w:val="single" w:color="8C8C8C" w:sz="6"/>
-              <w:left w:val="single" w:color="8C8C8C" w:sz="6"/>
-              <w:bottom w:val="single" w:color="8C8C8C" w:sz="6"/>
-              <w:right w:val="single" w:color="8C8C8C" w:sz="6"/>
-            </w:tcBorders>
-            <w:tcMar>
-              <w:top w:type="dxa" w:w="100"/>
-              <w:left w:type="dxa" w:w="140"/>
-              <w:bottom w:type="dxa" w:w="100"/>
-              <w:right w:type="dxa" w:w="140"/>
-            </w:tcMar>
-          </w:tcPr>
-          <w:p>
-            <w:pPr>
-              <w:spacing w:after="0"/>
-            </w:pPr>
-            <w:r>
-              <w:rPr>
-                <w:rFonts w:ascii="Calibri" w:cs="Calibri" w:eastAsia="Calibri" w:hAnsi="Calibri"/>
-                <w:color w:val="000000"/>
-                <w:sz w:val="20"/>
-                <w:szCs w:val="20"/>
-              </w:rPr>
-              <w:t xml:space="preserve">Medium</w:t>
-            </w:r>
-          </w:p>
-        </w:tc>
-        <w:tc>
-          <w:tcPr>
-            <w:tcW w:type="dxa" w:w="2400"/>
-            <w:tcBorders>
-              <w:top w:val="single" w:color="8C8C8C" w:sz="6"/>
-              <w:left w:val="single" w:color="8C8C8C" w:sz="6"/>
-              <w:bottom w:val="single" w:color="8C8C8C" w:sz="6"/>
-              <w:right w:val="single" w:color="8C8C8C" w:sz="6"/>
-            </w:tcBorders>
-            <w:tcMar>
-              <w:top w:type="dxa" w:w="100"/>
-              <w:left w:type="dxa" w:w="140"/>
-              <w:bottom w:type="dxa" w:w="100"/>
-              <w:right w:type="dxa" w:w="140"/>
-            </w:tcMar>
-          </w:tcPr>
-          <w:p>
-            <w:pPr>
-              <w:spacing w:after="0"/>
-            </w:pPr>
-            <w:r>
-              <w:rPr>
-                <w:rFonts w:ascii="Calibri" w:cs="Calibri" w:eastAsia="Calibri" w:hAnsi="Calibri"/>
-                <w:color w:val="000000"/>
-                <w:sz w:val="20"/>
-                <w:szCs w:val="20"/>
-              </w:rPr>
-              <w:t xml:space="preserve">Before first hospital customer</w:t>
-            </w:r>
-          </w:p>
-        </w:tc>
-      </w:tr>
-      <w:tr>
-        <w:tc>
-          <w:tcPr>
-            <w:tcW w:type="dxa" w:w="400"/>
-            <w:tcBorders>
-              <w:top w:val="single" w:color="8C8C8C" w:sz="6"/>
-              <w:left w:val="single" w:color="8C8C8C" w:sz="6"/>
-              <w:bottom w:val="single" w:color="8C8C8C" w:sz="6"/>
-              <w:right w:val="single" w:color="8C8C8C" w:sz="6"/>
-            </w:tcBorders>
-            <w:tcMar>
-              <w:top w:type="dxa" w:w="100"/>
-              <w:left w:type="dxa" w:w="140"/>
-              <w:bottom w:type="dxa" w:w="100"/>
-              <w:right w:type="dxa" w:w="140"/>
-            </w:tcMar>
-          </w:tcPr>
-          <w:p>
-            <w:pPr>
-              <w:spacing w:after="0"/>
-            </w:pPr>
-            <w:r>
-              <w:rPr>
-                <w:rFonts w:ascii="Calibri" w:cs="Calibri" w:eastAsia="Calibri" w:hAnsi="Calibri"/>
-                <w:color w:val="000000"/>
-                <w:sz w:val="20"/>
-                <w:szCs w:val="20"/>
-              </w:rPr>
-              <w:t xml:space="preserve">2</w:t>
-            </w:r>
-          </w:p>
-        </w:tc>
-        <w:tc>
-          <w:tcPr>
-            <w:tcW w:type="dxa" w:w="3760"/>
-            <w:tcBorders>
-              <w:top w:val="single" w:color="8C8C8C" w:sz="6"/>
-              <w:left w:val="single" w:color="8C8C8C" w:sz="6"/>
-              <w:bottom w:val="single" w:color="8C8C8C" w:sz="6"/>
-              <w:right w:val="single" w:color="8C8C8C" w:sz="6"/>
-            </w:tcBorders>
-            <w:tcMar>
-              <w:top w:type="dxa" w:w="100"/>
-              <w:left w:type="dxa" w:w="140"/>
-              <w:bottom w:type="dxa" w:w="100"/>
-              <w:right w:type="dxa" w:w="140"/>
-            </w:tcMar>
-          </w:tcPr>
-          <w:p>
-            <w:pPr>
-              <w:spacing w:after="0"/>
-            </w:pPr>
-            <w:r>
-              <w:rPr>
-                <w:rFonts w:ascii="Calibri" w:cs="Calibri" w:eastAsia="Calibri" w:hAnsi="Calibri"/>
-                <w:color w:val="000000"/>
-                <w:sz w:val="20"/>
-                <w:szCs w:val="20"/>
-              </w:rPr>
-              <w:t xml:space="preserve">Tighten CI/CD policy from &lt;svc&gt;:* + Resource = "*" to per-resource scoping</w:t>
-            </w:r>
-          </w:p>
-        </w:tc>
-        <w:tc>
-          <w:tcPr>
-            <w:tcW w:type="dxa" w:w="1600"/>
-            <w:tcBorders>
-              <w:top w:val="single" w:color="8C8C8C" w:sz="6"/>
-              <w:left w:val="single" w:color="8C8C8C" w:sz="6"/>
-              <w:bottom w:val="single" w:color="8C8C8C" w:sz="6"/>
-              <w:right w:val="single" w:color="8C8C8C" w:sz="6"/>
-            </w:tcBorders>
-            <w:tcMar>
-              <w:top w:type="dxa" w:w="100"/>
-              <w:left w:type="dxa" w:w="140"/>
-              <w:bottom w:type="dxa" w:w="100"/>
-              <w:right w:type="dxa" w:w="140"/>
-            </w:tcMar>
-          </w:tcPr>
-          <w:p>
-            <w:pPr>
-              <w:spacing w:after="0"/>
-            </w:pPr>
-            <w:r>
-              <w:rPr>
-                <w:rFonts w:ascii="Calibri" w:cs="Calibri" w:eastAsia="Calibri" w:hAnsi="Calibri"/>
-                <w:color w:val="000000"/>
-                <w:sz w:val="20"/>
-                <w:szCs w:val="20"/>
-              </w:rPr>
-              <w:t xml:space="preserve">§164.308(a)(4)</w:t>
-            </w:r>
-          </w:p>
-        </w:tc>
-        <w:tc>
-          <w:tcPr>
-            <w:tcW w:type="dxa" w:w="1200"/>
-            <w:tcBorders>
-              <w:top w:val="single" w:color="8C8C8C" w:sz="6"/>
-              <w:left w:val="single" w:color="8C8C8C" w:sz="6"/>
-              <w:bottom w:val="single" w:color="8C8C8C" w:sz="6"/>
-              <w:right w:val="single" w:color="8C8C8C" w:sz="6"/>
-            </w:tcBorders>
-            <w:tcMar>
-              <w:top w:type="dxa" w:w="100"/>
-              <w:left w:type="dxa" w:w="140"/>
-              <w:bottom w:type="dxa" w:w="100"/>
-              <w:right w:type="dxa" w:w="140"/>
-            </w:tcMar>
-          </w:tcPr>
-          <w:p>
-            <w:pPr>
-              <w:spacing w:after="0"/>
-            </w:pPr>
-            <w:r>
-              <w:rPr>
-                <w:rFonts w:ascii="Calibri" w:cs="Calibri" w:eastAsia="Calibri" w:hAnsi="Calibri"/>
-                <w:color w:val="000000"/>
-                <w:sz w:val="20"/>
-                <w:szCs w:val="20"/>
-              </w:rPr>
-              <w:t xml:space="preserve">Low</w:t>
-            </w:r>
-          </w:p>
-        </w:tc>
-        <w:tc>
-          <w:tcPr>
-            <w:tcW w:type="dxa" w:w="2400"/>
-            <w:tcBorders>
-              <w:top w:val="single" w:color="8C8C8C" w:sz="6"/>
-              <w:left w:val="single" w:color="8C8C8C" w:sz="6"/>
-              <w:bottom w:val="single" w:color="8C8C8C" w:sz="6"/>
-              <w:right w:val="single" w:color="8C8C8C" w:sz="6"/>
-            </w:tcBorders>
-            <w:tcMar>
-              <w:top w:type="dxa" w:w="100"/>
-              <w:left w:type="dxa" w:w="140"/>
-              <w:bottom w:type="dxa" w:w="100"/>
-              <w:right w:type="dxa" w:w="140"/>
-            </w:tcMar>
-          </w:tcPr>
-          <w:p>
-            <w:pPr>
-              <w:spacing w:after="0"/>
-            </w:pPr>
-            <w:r>
-              <w:rPr>
-                <w:rFonts w:ascii="Calibri" w:cs="Calibri" w:eastAsia="Calibri" w:hAnsi="Calibri"/>
-                <w:color w:val="000000"/>
-                <w:sz w:val="20"/>
-                <w:szCs w:val="20"/>
-              </w:rPr>
-              <w:t xml:space="preserve">Q3</w:t>
-            </w:r>
-          </w:p>
-        </w:tc>
-      </w:tr>
-      <w:tr>
-        <w:tc>
-          <w:tcPr>
-            <w:tcW w:type="dxa" w:w="400"/>
-            <w:tcBorders>
-              <w:top w:val="single" w:color="8C8C8C" w:sz="6"/>
-              <w:left w:val="single" w:color="8C8C8C" w:sz="6"/>
-              <w:bottom w:val="single" w:color="8C8C8C" w:sz="6"/>
-              <w:right w:val="single" w:color="8C8C8C" w:sz="6"/>
-            </w:tcBorders>
-            <w:tcMar>
-              <w:top w:type="dxa" w:w="100"/>
-              <w:left w:type="dxa" w:w="140"/>
-              <w:bottom w:type="dxa" w:w="100"/>
-              <w:right w:type="dxa" w:w="140"/>
-            </w:tcMar>
-          </w:tcPr>
-          <w:p>
-            <w:pPr>
-              <w:spacing w:after="0"/>
-            </w:pPr>
-            <w:r>
-              <w:rPr>
-                <w:rFonts w:ascii="Calibri" w:cs="Calibri" w:eastAsia="Calibri" w:hAnsi="Calibri"/>
-                <w:color w:val="000000"/>
-                <w:sz w:val="20"/>
-                <w:szCs w:val="20"/>
-              </w:rPr>
-              <w:t xml:space="preserve">3</w:t>
-            </w:r>
-          </w:p>
-        </w:tc>
-        <w:tc>
-          <w:tcPr>
-            <w:tcW w:type="dxa" w:w="3760"/>
-            <w:tcBorders>
-              <w:top w:val="single" w:color="8C8C8C" w:sz="6"/>
-              <w:left w:val="single" w:color="8C8C8C" w:sz="6"/>
-              <w:bottom w:val="single" w:color="8C8C8C" w:sz="6"/>
-              <w:right w:val="single" w:color="8C8C8C" w:sz="6"/>
-            </w:tcBorders>
-            <w:tcMar>
-              <w:top w:type="dxa" w:w="100"/>
-              <w:left w:type="dxa" w:w="140"/>
-              <w:bottom w:type="dxa" w:w="100"/>
-              <w:right w:type="dxa" w:w="140"/>
-            </w:tcMar>
-          </w:tcPr>
-          <w:p>
-            <w:pPr>
-              <w:spacing w:after="0"/>
-            </w:pPr>
-            <w:r>
-              <w:rPr>
-                <w:rFonts w:ascii="Calibri" w:cs="Calibri" w:eastAsia="Calibri" w:hAnsi="Calibri"/>
-                <w:color w:val="000000"/>
-                <w:sz w:val="20"/>
-                <w:szCs w:val="20"/>
-              </w:rPr>
-              <w:t xml:space="preserve">Pin transcribe:* / comprehendmedical:* task perms to specific output ARN</w:t>
-            </w:r>
-          </w:p>
-        </w:tc>
-        <w:tc>
-          <w:tcPr>
-            <w:tcW w:type="dxa" w:w="1600"/>
-            <w:tcBorders>
-              <w:top w:val="single" w:color="8C8C8C" w:sz="6"/>
-              <w:left w:val="single" w:color="8C8C8C" w:sz="6"/>
-              <w:bottom w:val="single" w:color="8C8C8C" w:sz="6"/>
-              <w:right w:val="single" w:color="8C8C8C" w:sz="6"/>
-            </w:tcBorders>
-            <w:tcMar>
-              <w:top w:type="dxa" w:w="100"/>
-              <w:left w:type="dxa" w:w="140"/>
-              <w:bottom w:type="dxa" w:w="100"/>
-              <w:right w:type="dxa" w:w="140"/>
-            </w:tcMar>
-          </w:tcPr>
-          <w:p>
-            <w:pPr>
-              <w:spacing w:after="0"/>
-            </w:pPr>
-            <w:r>
-              <w:rPr>
-                <w:rFonts w:ascii="Calibri" w:cs="Calibri" w:eastAsia="Calibri" w:hAnsi="Calibri"/>
-                <w:color w:val="000000"/>
-                <w:sz w:val="20"/>
-                <w:szCs w:val="20"/>
-              </w:rPr>
-              <w:t xml:space="preserve">§164.308(a)(4)</w:t>
-            </w:r>
-          </w:p>
-        </w:tc>
-        <w:tc>
-          <w:tcPr>
-            <w:tcW w:type="dxa" w:w="1200"/>
-            <w:tcBorders>
-              <w:top w:val="single" w:color="8C8C8C" w:sz="6"/>
-              <w:left w:val="single" w:color="8C8C8C" w:sz="6"/>
-              <w:bottom w:val="single" w:color="8C8C8C" w:sz="6"/>
-              <w:right w:val="single" w:color="8C8C8C" w:sz="6"/>
-            </w:tcBorders>
-            <w:tcMar>
-              <w:top w:type="dxa" w:w="100"/>
-              <w:left w:type="dxa" w:w="140"/>
-              <w:bottom w:type="dxa" w:w="100"/>
-              <w:right w:type="dxa" w:w="140"/>
-            </w:tcMar>
-          </w:tcPr>
-          <w:p>
-            <w:pPr>
-              <w:spacing w:after="0"/>
-            </w:pPr>
-            <w:r>
-              <w:rPr>
-                <w:rFonts w:ascii="Calibri" w:cs="Calibri" w:eastAsia="Calibri" w:hAnsi="Calibri"/>
-                <w:color w:val="000000"/>
-                <w:sz w:val="20"/>
-                <w:szCs w:val="20"/>
-              </w:rPr>
-              <w:t xml:space="preserve">Low</w:t>
-            </w:r>
-          </w:p>
-        </w:tc>
-        <w:tc>
-          <w:tcPr>
-            <w:tcW w:type="dxa" w:w="2400"/>
-            <w:tcBorders>
-              <w:top w:val="single" w:color="8C8C8C" w:sz="6"/>
-              <w:left w:val="single" w:color="8C8C8C" w:sz="6"/>
-              <w:bottom w:val="single" w:color="8C8C8C" w:sz="6"/>
-              <w:right w:val="single" w:color="8C8C8C" w:sz="6"/>
-            </w:tcBorders>
-            <w:tcMar>
-              <w:top w:type="dxa" w:w="100"/>
-              <w:left w:type="dxa" w:w="140"/>
-              <w:bottom w:type="dxa" w:w="100"/>
-              <w:right w:type="dxa" w:w="140"/>
-            </w:tcMar>
-          </w:tcPr>
-          <w:p>
-            <w:pPr>
-              <w:spacing w:after="0"/>
-            </w:pPr>
-            <w:r>
-              <w:rPr>
-                <w:rFonts w:ascii="Calibri" w:cs="Calibri" w:eastAsia="Calibri" w:hAnsi="Calibri"/>
-                <w:color w:val="000000"/>
-                <w:sz w:val="20"/>
-                <w:szCs w:val="20"/>
-              </w:rPr>
-              <w:t xml:space="preserve">Q3</w:t>
-            </w:r>
-          </w:p>
-        </w:tc>
-      </w:tr>
-      <w:tr>
-        <w:tc>
-          <w:tcPr>
-            <w:tcW w:type="dxa" w:w="400"/>
-            <w:tcBorders>
-              <w:top w:val="single" w:color="8C8C8C" w:sz="6"/>
-              <w:left w:val="single" w:color="8C8C8C" w:sz="6"/>
-              <w:bottom w:val="single" w:color="8C8C8C" w:sz="6"/>
-              <w:right w:val="single" w:color="8C8C8C" w:sz="6"/>
-            </w:tcBorders>
-            <w:tcMar>
-              <w:top w:type="dxa" w:w="100"/>
-              <w:left w:type="dxa" w:w="140"/>
-              <w:bottom w:type="dxa" w:w="100"/>
-              <w:right w:type="dxa" w:w="140"/>
-            </w:tcMar>
-          </w:tcPr>
-          <w:p>
-            <w:pPr>
-              <w:spacing w:after="0"/>
-            </w:pPr>
-            <w:r>
-              <w:rPr>
-                <w:rFonts w:ascii="Calibri" w:cs="Calibri" w:eastAsia="Calibri" w:hAnsi="Calibri"/>
-                <w:color w:val="000000"/>
-                <w:sz w:val="20"/>
-                <w:szCs w:val="20"/>
-              </w:rPr>
-              <w:t xml:space="preserve">4</w:t>
-            </w:r>
-          </w:p>
-        </w:tc>
-        <w:tc>
-          <w:tcPr>
-            <w:tcW w:type="dxa" w:w="3760"/>
-            <w:tcBorders>
-              <w:top w:val="single" w:color="8C8C8C" w:sz="6"/>
-              <w:left w:val="single" w:color="8C8C8C" w:sz="6"/>
-              <w:bottom w:val="single" w:color="8C8C8C" w:sz="6"/>
-              <w:right w:val="single" w:color="8C8C8C" w:sz="6"/>
-            </w:tcBorders>
-            <w:tcMar>
-              <w:top w:type="dxa" w:w="100"/>
-              <w:left w:type="dxa" w:w="140"/>
-              <w:bottom w:type="dxa" w:w="100"/>
-              <w:right w:type="dxa" w:w="140"/>
-            </w:tcMar>
-          </w:tcPr>
-          <w:p>
-            <w:pPr>
-              <w:spacing w:after="0"/>
-            </w:pPr>
-            <w:r>
-              <w:rPr>
-                <w:rFonts w:ascii="Calibri" w:cs="Calibri" w:eastAsia="Calibri" w:hAnsi="Calibri"/>
-                <w:color w:val="000000"/>
-                <w:sz w:val="20"/>
-                <w:szCs w:val="20"/>
-              </w:rPr>
-              <w:t xml:space="preserve">Pin RDS rds-db:connect to specific dbuser</w:t>
-            </w:r>
-          </w:p>
-        </w:tc>
-        <w:tc>
-          <w:tcPr>
-            <w:tcW w:type="dxa" w:w="1600"/>
-            <w:tcBorders>
-              <w:top w:val="single" w:color="8C8C8C" w:sz="6"/>
-              <w:left w:val="single" w:color="8C8C8C" w:sz="6"/>
-              <w:bottom w:val="single" w:color="8C8C8C" w:sz="6"/>
-              <w:right w:val="single" w:color="8C8C8C" w:sz="6"/>
-            </w:tcBorders>
-            <w:tcMar>
-              <w:top w:type="dxa" w:w="100"/>
-              <w:left w:type="dxa" w:w="140"/>
-              <w:bottom w:type="dxa" w:w="100"/>
-              <w:right w:type="dxa" w:w="140"/>
-            </w:tcMar>
-          </w:tcPr>
-          <w:p>
-            <w:pPr>
-              <w:spacing w:after="0"/>
-            </w:pPr>
-            <w:r>
-              <w:rPr>
-                <w:rFonts w:ascii="Calibri" w:cs="Calibri" w:eastAsia="Calibri" w:hAnsi="Calibri"/>
-                <w:color w:val="000000"/>
-                <w:sz w:val="20"/>
-                <w:szCs w:val="20"/>
-              </w:rPr>
-              <w:t xml:space="preserve">§164.308(a)(4)</w:t>
-            </w:r>
-          </w:p>
-        </w:tc>
-        <w:tc>
-          <w:tcPr>
-            <w:tcW w:type="dxa" w:w="1200"/>
-            <w:tcBorders>
-              <w:top w:val="single" w:color="8C8C8C" w:sz="6"/>
-              <w:left w:val="single" w:color="8C8C8C" w:sz="6"/>
-              <w:bottom w:val="single" w:color="8C8C8C" w:sz="6"/>
-              <w:right w:val="single" w:color="8C8C8C" w:sz="6"/>
-            </w:tcBorders>
-            <w:tcMar>
-              <w:top w:type="dxa" w:w="100"/>
-              <w:left w:type="dxa" w:w="140"/>
-              <w:bottom w:type="dxa" w:w="100"/>
-              <w:right w:type="dxa" w:w="140"/>
-            </w:tcMar>
-          </w:tcPr>
-          <w:p>
-            <w:pPr>
-              <w:spacing w:after="0"/>
-            </w:pPr>
-            <w:r>
-              <w:rPr>
-                <w:rFonts w:ascii="Calibri" w:cs="Calibri" w:eastAsia="Calibri" w:hAnsi="Calibri"/>
-                <w:color w:val="000000"/>
-                <w:sz w:val="20"/>
-                <w:szCs w:val="20"/>
-              </w:rPr>
-              <w:t xml:space="preserve">Low</w:t>
-            </w:r>
-          </w:p>
-        </w:tc>
-        <w:tc>
-          <w:tcPr>
-            <w:tcW w:type="dxa" w:w="2400"/>
-            <w:tcBorders>
-              <w:top w:val="single" w:color="8C8C8C" w:sz="6"/>
-              <w:left w:val="single" w:color="8C8C8C" w:sz="6"/>
-              <w:bottom w:val="single" w:color="8C8C8C" w:sz="6"/>
-              <w:right w:val="single" w:color="8C8C8C" w:sz="6"/>
-            </w:tcBorders>
-            <w:tcMar>
-              <w:top w:type="dxa" w:w="100"/>
-              <w:left w:type="dxa" w:w="140"/>
-              <w:bottom w:type="dxa" w:w="100"/>
-              <w:right w:type="dxa" w:w="140"/>
-            </w:tcMar>
-          </w:tcPr>
-          <w:p>
-            <w:pPr>
-              <w:spacing w:after="0"/>
-            </w:pPr>
-            <w:r>
-              <w:rPr>
-                <w:rFonts w:ascii="Calibri" w:cs="Calibri" w:eastAsia="Calibri" w:hAnsi="Calibri"/>
-                <w:color w:val="000000"/>
-                <w:sz w:val="20"/>
-                <w:szCs w:val="20"/>
-              </w:rPr>
-              <w:t xml:space="preserve">Q3</w:t>
-            </w:r>
-          </w:p>
-        </w:tc>
-      </w:tr>
-      <w:tr>
-        <w:tc>
-          <w:tcPr>
-            <w:tcW w:type="dxa" w:w="400"/>
-            <w:tcBorders>
-              <w:top w:val="single" w:color="8C8C8C" w:sz="6"/>
-              <w:left w:val="single" w:color="8C8C8C" w:sz="6"/>
-              <w:bottom w:val="single" w:color="8C8C8C" w:sz="6"/>
-              <w:right w:val="single" w:color="8C8C8C" w:sz="6"/>
-            </w:tcBorders>
-            <w:tcMar>
-              <w:top w:type="dxa" w:w="100"/>
-              <w:left w:type="dxa" w:w="140"/>
-              <w:bottom w:type="dxa" w:w="100"/>
-              <w:right w:type="dxa" w:w="140"/>
-            </w:tcMar>
-          </w:tcPr>
-          <w:p>
-            <w:pPr>
-              <w:spacing w:after="0"/>
-            </w:pPr>
-            <w:r>
-              <w:rPr>
-                <w:rFonts w:ascii="Calibri" w:cs="Calibri" w:eastAsia="Calibri" w:hAnsi="Calibri"/>
-                <w:color w:val="000000"/>
-                <w:sz w:val="20"/>
-                <w:szCs w:val="20"/>
-              </w:rPr>
-              <w:t xml:space="preserve">5</w:t>
-            </w:r>
-          </w:p>
-        </w:tc>
-        <w:tc>
-          <w:tcPr>
-            <w:tcW w:type="dxa" w:w="3760"/>
-            <w:tcBorders>
-              <w:top w:val="single" w:color="8C8C8C" w:sz="6"/>
-              <w:left w:val="single" w:color="8C8C8C" w:sz="6"/>
-              <w:bottom w:val="single" w:color="8C8C8C" w:sz="6"/>
-              <w:right w:val="single" w:color="8C8C8C" w:sz="6"/>
-            </w:tcBorders>
-            <w:tcMar>
-              <w:top w:type="dxa" w:w="100"/>
-              <w:left w:type="dxa" w:w="140"/>
-              <w:bottom w:type="dxa" w:w="100"/>
-              <w:right w:type="dxa" w:w="140"/>
-            </w:tcMar>
-          </w:tcPr>
-          <w:p>
-            <w:pPr>
-              <w:spacing w:after="0"/>
-            </w:pPr>
-            <w:r>
-              <w:rPr>
-                <w:rFonts w:ascii="Calibri" w:cs="Calibri" w:eastAsia="Calibri" w:hAnsi="Calibri"/>
-                <w:color w:val="000000"/>
-                <w:sz w:val="20"/>
-                <w:szCs w:val="20"/>
-              </w:rPr>
-              <w:t xml:space="preserve">Enable AWS Config for continuous compliance recording</w:t>
-            </w:r>
-          </w:p>
-        </w:tc>
-        <w:tc>
-          <w:tcPr>
-            <w:tcW w:type="dxa" w:w="1600"/>
-            <w:tcBorders>
-              <w:top w:val="single" w:color="8C8C8C" w:sz="6"/>
-              <w:left w:val="single" w:color="8C8C8C" w:sz="6"/>
-              <w:bottom w:val="single" w:color="8C8C8C" w:sz="6"/>
-              <w:right w:val="single" w:color="8C8C8C" w:sz="6"/>
-            </w:tcBorders>
-            <w:tcMar>
-              <w:top w:type="dxa" w:w="100"/>
-              <w:left w:type="dxa" w:w="140"/>
-              <w:bottom w:type="dxa" w:w="100"/>
-              <w:right w:type="dxa" w:w="140"/>
-            </w:tcMar>
-          </w:tcPr>
-          <w:p>
-            <w:pPr>
-              <w:spacing w:after="0"/>
-            </w:pPr>
-            <w:r>
-              <w:rPr>
-                <w:rFonts w:ascii="Calibri" w:cs="Calibri" w:eastAsia="Calibri" w:hAnsi="Calibri"/>
-                <w:color w:val="000000"/>
-                <w:sz w:val="20"/>
-                <w:szCs w:val="20"/>
-              </w:rPr>
-              <w:t xml:space="preserve">§164.308(a)(1)</w:t>
-            </w:r>
-          </w:p>
-        </w:tc>
-        <w:tc>
-          <w:tcPr>
-            <w:tcW w:type="dxa" w:w="1200"/>
-            <w:tcBorders>
-              <w:top w:val="single" w:color="8C8C8C" w:sz="6"/>
-              <w:left w:val="single" w:color="8C8C8C" w:sz="6"/>
-              <w:bottom w:val="single" w:color="8C8C8C" w:sz="6"/>
-              <w:right w:val="single" w:color="8C8C8C" w:sz="6"/>
-            </w:tcBorders>
-            <w:tcMar>
-              <w:top w:type="dxa" w:w="100"/>
-              <w:left w:type="dxa" w:w="140"/>
-              <w:bottom w:type="dxa" w:w="100"/>
-              <w:right w:type="dxa" w:w="140"/>
-            </w:tcMar>
-          </w:tcPr>
-          <w:p>
-            <w:pPr>
-              <w:spacing w:after="0"/>
-            </w:pPr>
-            <w:r>
-              <w:rPr>
-                <w:rFonts w:ascii="Calibri" w:cs="Calibri" w:eastAsia="Calibri" w:hAnsi="Calibri"/>
-                <w:color w:val="000000"/>
-                <w:sz w:val="20"/>
-                <w:szCs w:val="20"/>
-              </w:rPr>
-              <w:t xml:space="preserve">Low</w:t>
-            </w:r>
-          </w:p>
-        </w:tc>
-        <w:tc>
-          <w:tcPr>
-            <w:tcW w:type="dxa" w:w="2400"/>
-            <w:tcBorders>
-              <w:top w:val="single" w:color="8C8C8C" w:sz="6"/>
-              <w:left w:val="single" w:color="8C8C8C" w:sz="6"/>
-              <w:bottom w:val="single" w:color="8C8C8C" w:sz="6"/>
-              <w:right w:val="single" w:color="8C8C8C" w:sz="6"/>
-            </w:tcBorders>
-            <w:tcMar>
-              <w:top w:type="dxa" w:w="100"/>
-              <w:left w:type="dxa" w:w="140"/>
-              <w:bottom w:type="dxa" w:w="100"/>
-              <w:right w:type="dxa" w:w="140"/>
-            </w:tcMar>
-          </w:tcPr>
-          <w:p>
-            <w:pPr>
-              <w:spacing w:after="0"/>
-            </w:pPr>
-            <w:r>
-              <w:rPr>
-                <w:rFonts w:ascii="Calibri" w:cs="Calibri" w:eastAsia="Calibri" w:hAnsi="Calibri"/>
-                <w:color w:val="000000"/>
-                <w:sz w:val="20"/>
-                <w:szCs w:val="20"/>
-              </w:rPr>
-              <w:t xml:space="preserve">Backlog</w:t>
-            </w:r>
-          </w:p>
-        </w:tc>
-      </w:tr>
-      <w:tr>
-        <w:tc>
-          <w:tcPr>
-            <w:tcW w:type="dxa" w:w="400"/>
-            <w:tcBorders>
-              <w:top w:val="single" w:color="8C8C8C" w:sz="6"/>
-              <w:left w:val="single" w:color="8C8C8C" w:sz="6"/>
-              <w:bottom w:val="single" w:color="8C8C8C" w:sz="6"/>
-              <w:right w:val="single" w:color="8C8C8C" w:sz="6"/>
-            </w:tcBorders>
-            <w:tcMar>
-              <w:top w:type="dxa" w:w="100"/>
-              <w:left w:type="dxa" w:w="140"/>
-              <w:bottom w:type="dxa" w:w="100"/>
-              <w:right w:type="dxa" w:w="140"/>
-            </w:tcMar>
-          </w:tcPr>
-          <w:p>
-            <w:pPr>
-              <w:spacing w:after="0"/>
-            </w:pPr>
-            <w:r>
-              <w:rPr>
-                <w:rFonts w:ascii="Calibri" w:cs="Calibri" w:eastAsia="Calibri" w:hAnsi="Calibri"/>
-                <w:color w:val="000000"/>
-                <w:sz w:val="20"/>
-                <w:szCs w:val="20"/>
-              </w:rPr>
-              <w:t xml:space="preserve">6</w:t>
-            </w:r>
-          </w:p>
-        </w:tc>
-        <w:tc>
-          <w:tcPr>
-            <w:tcW w:type="dxa" w:w="3760"/>
-            <w:tcBorders>
-              <w:top w:val="single" w:color="8C8C8C" w:sz="6"/>
-              <w:left w:val="single" w:color="8C8C8C" w:sz="6"/>
-              <w:bottom w:val="single" w:color="8C8C8C" w:sz="6"/>
-              <w:right w:val="single" w:color="8C8C8C" w:sz="6"/>
-            </w:tcBorders>
-            <w:tcMar>
-              <w:top w:type="dxa" w:w="100"/>
-              <w:left w:type="dxa" w:w="140"/>
-              <w:bottom w:type="dxa" w:w="100"/>
-              <w:right w:type="dxa" w:w="140"/>
-            </w:tcMar>
-          </w:tcPr>
-          <w:p>
-            <w:pPr>
-              <w:spacing w:after="0"/>
-            </w:pPr>
-            <w:r>
-              <w:rPr>
-                <w:rFonts w:ascii="Calibri" w:cs="Calibri" w:eastAsia="Calibri" w:hAnsi="Calibri"/>
-                <w:color w:val="000000"/>
-                <w:sz w:val="20"/>
-                <w:szCs w:val="20"/>
-              </w:rPr>
-              <w:t xml:space="preserve">Formalize runbooks/incident-response.md</w:t>
-            </w:r>
-          </w:p>
-        </w:tc>
-        <w:tc>
-          <w:tcPr>
-            <w:tcW w:type="dxa" w:w="1600"/>
-            <w:tcBorders>
-              <w:top w:val="single" w:color="8C8C8C" w:sz="6"/>
-              <w:left w:val="single" w:color="8C8C8C" w:sz="6"/>
-              <w:bottom w:val="single" w:color="8C8C8C" w:sz="6"/>
-              <w:right w:val="single" w:color="8C8C8C" w:sz="6"/>
-            </w:tcBorders>
-            <w:tcMar>
-              <w:top w:type="dxa" w:w="100"/>
-              <w:left w:type="dxa" w:w="140"/>
-              <w:bottom w:type="dxa" w:w="100"/>
-              <w:right w:type="dxa" w:w="140"/>
-            </w:tcMar>
-          </w:tcPr>
-          <w:p>
-            <w:pPr>
-              <w:spacing w:after="0"/>
-            </w:pPr>
-            <w:r>
-              <w:rPr>
-                <w:rFonts w:ascii="Calibri" w:cs="Calibri" w:eastAsia="Calibri" w:hAnsi="Calibri"/>
-                <w:color w:val="000000"/>
-                <w:sz w:val="20"/>
-                <w:szCs w:val="20"/>
-              </w:rPr>
-              <w:t xml:space="preserve">§164.308(a)(6)</w:t>
-            </w:r>
-          </w:p>
-        </w:tc>
-        <w:tc>
-          <w:tcPr>
-            <w:tcW w:type="dxa" w:w="1200"/>
-            <w:tcBorders>
-              <w:top w:val="single" w:color="8C8C8C" w:sz="6"/>
-              <w:left w:val="single" w:color="8C8C8C" w:sz="6"/>
-              <w:bottom w:val="single" w:color="8C8C8C" w:sz="6"/>
-              <w:right w:val="single" w:color="8C8C8C" w:sz="6"/>
-            </w:tcBorders>
-            <w:tcMar>
-              <w:top w:type="dxa" w:w="100"/>
-              <w:left w:type="dxa" w:w="140"/>
-              <w:bottom w:type="dxa" w:w="100"/>
-              <w:right w:type="dxa" w:w="140"/>
-            </w:tcMar>
-          </w:tcPr>
-          <w:p>
-            <w:pPr>
-              <w:spacing w:after="0"/>
-            </w:pPr>
-            <w:r>
-              <w:rPr>
-                <w:rFonts w:ascii="Calibri" w:cs="Calibri" w:eastAsia="Calibri" w:hAnsi="Calibri"/>
-                <w:color w:val="000000"/>
-                <w:sz w:val="20"/>
-                <w:szCs w:val="20"/>
-              </w:rPr>
-              <w:t xml:space="preserve">Low</w:t>
-            </w:r>
-          </w:p>
-        </w:tc>
-        <w:tc>
-          <w:tcPr>
-            <w:tcW w:type="dxa" w:w="2400"/>
-            <w:tcBorders>
-              <w:top w:val="single" w:color="8C8C8C" w:sz="6"/>
-              <w:left w:val="single" w:color="8C8C8C" w:sz="6"/>
-              <w:bottom w:val="single" w:color="8C8C8C" w:sz="6"/>
-              <w:right w:val="single" w:color="8C8C8C" w:sz="6"/>
-            </w:tcBorders>
-            <w:tcMar>
-              <w:top w:type="dxa" w:w="100"/>
-              <w:left w:type="dxa" w:w="140"/>
-              <w:bottom w:type="dxa" w:w="100"/>
-              <w:right w:type="dxa" w:w="140"/>
-            </w:tcMar>
-          </w:tcPr>
-          <w:p>
-            <w:pPr>
-              <w:spacing w:after="0"/>
-            </w:pPr>
-            <w:r>
-              <w:rPr>
-                <w:rFonts w:ascii="Calibri" w:cs="Calibri" w:eastAsia="Calibri" w:hAnsi="Calibri"/>
-                <w:color w:val="000000"/>
-                <w:sz w:val="20"/>
-                <w:szCs w:val="20"/>
-              </w:rPr>
-              <w:t xml:space="preserve">Q3</w:t>
-            </w:r>
-          </w:p>
-        </w:tc>
-      </w:tr>
-      <w:tr>
-        <w:tc>
-          <w:tcPr>
-            <w:tcW w:type="dxa" w:w="400"/>
-            <w:tcBorders>
-              <w:top w:val="single" w:color="8C8C8C" w:sz="6"/>
-              <w:left w:val="single" w:color="8C8C8C" w:sz="6"/>
-              <w:bottom w:val="single" w:color="8C8C8C" w:sz="6"/>
-              <w:right w:val="single" w:color="8C8C8C" w:sz="6"/>
-            </w:tcBorders>
-            <w:tcMar>
-              <w:top w:type="dxa" w:w="100"/>
-              <w:left w:type="dxa" w:w="140"/>
-              <w:bottom w:type="dxa" w:w="100"/>
-              <w:right w:type="dxa" w:w="140"/>
-            </w:tcMar>
-          </w:tcPr>
-          <w:p>
-            <w:pPr>
-              <w:spacing w:after="0"/>
-            </w:pPr>
-            <w:r>
-              <w:rPr>
-                <w:rFonts w:ascii="Calibri" w:cs="Calibri" w:eastAsia="Calibri" w:hAnsi="Calibri"/>
-                <w:color w:val="000000"/>
-                <w:sz w:val="20"/>
-                <w:szCs w:val="20"/>
-              </w:rPr>
-              <w:t xml:space="preserve">7</w:t>
-            </w:r>
-          </w:p>
-        </w:tc>
-        <w:tc>
-          <w:tcPr>
-            <w:tcW w:type="dxa" w:w="3760"/>
-            <w:tcBorders>
-              <w:top w:val="single" w:color="8C8C8C" w:sz="6"/>
-              <w:left w:val="single" w:color="8C8C8C" w:sz="6"/>
-              <w:bottom w:val="single" w:color="8C8C8C" w:sz="6"/>
-              <w:right w:val="single" w:color="8C8C8C" w:sz="6"/>
-            </w:tcBorders>
-            <w:tcMar>
-              <w:top w:type="dxa" w:w="100"/>
-              <w:left w:type="dxa" w:w="140"/>
-              <w:bottom w:type="dxa" w:w="100"/>
-              <w:right w:type="dxa" w:w="140"/>
-            </w:tcMar>
-          </w:tcPr>
-          <w:p>
-            <w:pPr>
-              <w:spacing w:after="0"/>
-            </w:pPr>
-            <w:r>
-              <w:rPr>
-                <w:rFonts w:ascii="Calibri" w:cs="Calibri" w:eastAsia="Calibri" w:hAnsi="Calibri"/>
-                <w:color w:val="000000"/>
-                <w:sz w:val="20"/>
-                <w:szCs w:val="20"/>
-              </w:rPr>
-              <w:t xml:space="preserve">Annual third-party HIPAA assessment</w:t>
-            </w:r>
-          </w:p>
-        </w:tc>
-        <w:tc>
-          <w:tcPr>
-            <w:tcW w:type="dxa" w:w="1600"/>
-            <w:tcBorders>
-              <w:top w:val="single" w:color="8C8C8C" w:sz="6"/>
-              <w:left w:val="single" w:color="8C8C8C" w:sz="6"/>
-              <w:bottom w:val="single" w:color="8C8C8C" w:sz="6"/>
-              <w:right w:val="single" w:color="8C8C8C" w:sz="6"/>
-            </w:tcBorders>
-            <w:tcMar>
-              <w:top w:type="dxa" w:w="100"/>
-              <w:left w:type="dxa" w:w="140"/>
-              <w:bottom w:type="dxa" w:w="100"/>
-              <w:right w:type="dxa" w:w="140"/>
-            </w:tcMar>
-          </w:tcPr>
-          <w:p>
-            <w:pPr>
-              <w:spacing w:after="0"/>
-            </w:pPr>
-            <w:r>
-              <w:rPr>
-                <w:rFonts w:ascii="Calibri" w:cs="Calibri" w:eastAsia="Calibri" w:hAnsi="Calibri"/>
-                <w:color w:val="000000"/>
-                <w:sz w:val="20"/>
-                <w:szCs w:val="20"/>
-              </w:rPr>
-              <w:t xml:space="preserve">§164.308(a)(8)</w:t>
-            </w:r>
-          </w:p>
-        </w:tc>
-        <w:tc>
-          <w:tcPr>
-            <w:tcW w:type="dxa" w:w="1200"/>
-            <w:tcBorders>
-              <w:top w:val="single" w:color="8C8C8C" w:sz="6"/>
-              <w:left w:val="single" w:color="8C8C8C" w:sz="6"/>
-              <w:bottom w:val="single" w:color="8C8C8C" w:sz="6"/>
-              <w:right w:val="single" w:color="8C8C8C" w:sz="6"/>
-            </w:tcBorders>
-            <w:tcMar>
-              <w:top w:type="dxa" w:w="100"/>
-              <w:left w:type="dxa" w:w="140"/>
-              <w:bottom w:type="dxa" w:w="100"/>
-              <w:right w:type="dxa" w:w="140"/>
-            </w:tcMar>
-          </w:tcPr>
-          <w:p>
-            <w:pPr>
-              <w:spacing w:after="0"/>
-            </w:pPr>
-            <w:r>
-              <w:rPr>
-                <w:rFonts w:ascii="Calibri" w:cs="Calibri" w:eastAsia="Calibri" w:hAnsi="Calibri"/>
-                <w:color w:val="000000"/>
-                <w:sz w:val="20"/>
-                <w:szCs w:val="20"/>
-              </w:rPr>
-              <w:t xml:space="preserve">Recommended</w:t>
-            </w:r>
-          </w:p>
-        </w:tc>
-        <w:tc>
-          <w:tcPr>
-            <w:tcW w:type="dxa" w:w="2400"/>
-            <w:tcBorders>
-              <w:top w:val="single" w:color="8C8C8C" w:sz="6"/>
-              <w:left w:val="single" w:color="8C8C8C" w:sz="6"/>
-              <w:bottom w:val="single" w:color="8C8C8C" w:sz="6"/>
-              <w:right w:val="single" w:color="8C8C8C" w:sz="6"/>
-            </w:tcBorders>
-            <w:tcMar>
-              <w:top w:type="dxa" w:w="100"/>
-              <w:left w:type="dxa" w:w="140"/>
-              <w:bottom w:type="dxa" w:w="100"/>
-              <w:right w:type="dxa" w:w="140"/>
-            </w:tcMar>
-          </w:tcPr>
-          <w:p>
-            <w:pPr>
-              <w:spacing w:after="0"/>
-            </w:pPr>
-            <w:r>
-              <w:rPr>
-                <w:rFonts w:ascii="Calibri" w:cs="Calibri" w:eastAsia="Calibri" w:hAnsi="Calibri"/>
-                <w:color w:val="000000"/>
-                <w:sz w:val="20"/>
-                <w:szCs w:val="20"/>
-              </w:rPr>
-              <w:t xml:space="preserve">Leadership</w:t>
-            </w:r>
-          </w:p>
-        </w:tc>
-      </w:tr>
-    </w:tbl>
-    <w:p>
-      <w:pPr>
-        <w:spacing w:after="80"/>
-      </w:pPr>
-      <w:r>
-        <w:rPr>
-          <w:rFonts w:ascii="Calibri" w:cs="Calibri" w:eastAsia="Calibri" w:hAnsi="Calibri"/>
-          <w:sz w:val="22"/>
-          <w:szCs w:val="22"/>
-        </w:rPr>
-        <w:t xml:space="preserve"> </w:t>
-      </w:r>
-    </w:p>
-    <w:p>
-      <w:pPr>
-        <w:spacing w:after="120"/>
-      </w:pPr>
-      <w:r>
-        <w:rPr>
-          <w:rFonts w:ascii="Calibri" w:cs="Calibri" w:eastAsia="Calibri" w:hAnsi="Calibri"/>
-          <w:color w:val="000000"/>
-          <w:sz w:val="22"/>
-          <w:szCs w:val="22"/>
-        </w:rPr>
-        <w:t xml:space="preserve">None block BAA compliance. Items 1–4 hardening is gated to first hospital/insurer customer onboarding.</w:t>
-      </w:r>
-    </w:p>
-    <w:p>
-      <w:pPr>
-        <w:pStyle w:val="Heading1"/>
-        <w:spacing w:after="180" w:before="360"/>
-      </w:pPr>
-      <w:r>
-        <w:rPr>
-          <w:rFonts w:ascii="Calibri" w:cs="Calibri" w:eastAsia="Calibri" w:hAnsi="Calibri"/>
-          <w:b/>
-          <w:bCs/>
-          <w:color w:val="2E75B6"/>
-          <w:sz w:val="36"/>
-          <w:szCs w:val="36"/>
-        </w:rPr>
-        <w:t xml:space="preserve">12. KMS Key Inventory</w:t>
+        <w:t xml:space="preserve">11. KMS Key Inventory</w:t>
       </w:r>
     </w:p>
     <w:tbl>
@@ -6629,7 +5261,7 @@
           <w:sz w:val="36"/>
           <w:szCs w:val="36"/>
         </w:rPr>
-        <w:t xml:space="preserve">13. Sign-off</w:t>
+        <w:t xml:space="preserve">12. Sign-off</w:t>
       </w:r>
     </w:p>
     <w:p>
@@ -6643,7 +5275,7 @@
           <w:sz w:val="22"/>
           <w:szCs w:val="22"/>
         </w:rPr>
-        <w:t xml:space="preserve">The undersigned acknowledges the safeguards described, the signed AWS BAA, the gap-remediation timeline, and the continuous-verification mechanism.</w:t>
+        <w:t xml:space="preserve">The undersigned acknowledges the safeguards described, the signed AWS BAA, and the continuous-verification mechanism.</w:t>
       </w:r>
     </w:p>
     <w:p>
@@ -6877,7 +5509,7 @@
                 <w:sz w:val="20"/>
                 <w:szCs w:val="20"/>
               </w:rPr>
-              <w:t xml:space="preserve">Dhrumil Mehta</w:t>
+              <w:t xml:space="preserve"/>
             </w:r>
           </w:p>
         </w:tc>

</xml_diff>